<commit_message>
Update LABlogbook.docx and remove temporary Blogbook file
</commit_message>
<xml_diff>
--- a/LABlogbook.docx
+++ b/LABlogbook.docx
@@ -578,6 +578,173 @@
           <w:u w:val="single"/>
         </w:rPr>
       </w:pPr>
+      <w:r>
+        <w:rPr>
+          <w:noProof/>
+          <w:sz w:val="44"/>
+          <w:szCs w:val="44"/>
+          <w:u w:val="single"/>
+        </w:rPr>
+        <w:drawing>
+          <wp:inline distT="0" distB="0" distL="0" distR="0" wp14:anchorId="1ED9D234" wp14:editId="6BF7B4C9">
+            <wp:extent cx="5731510" cy="2878455"/>
+            <wp:effectExtent l="0" t="0" r="0" b="4445"/>
+            <wp:docPr id="1689821695" name="Picture 1" descr="A screenshot of a computer&#10;&#10;AI-generated content may be incorrect."/>
+            <wp:cNvGraphicFramePr>
+              <a:graphicFrameLocks xmlns:a="http://schemas.openxmlformats.org/drawingml/2006/main" noChangeAspect="1"/>
+            </wp:cNvGraphicFramePr>
+            <a:graphic xmlns:a="http://schemas.openxmlformats.org/drawingml/2006/main">
+              <a:graphicData uri="http://schemas.openxmlformats.org/drawingml/2006/picture">
+                <pic:pic xmlns:pic="http://schemas.openxmlformats.org/drawingml/2006/picture">
+                  <pic:nvPicPr>
+                    <pic:cNvPr id="1689821695" name="Picture 1" descr="A screenshot of a computer&#10;&#10;AI-generated content may be incorrect."/>
+                    <pic:cNvPicPr/>
+                  </pic:nvPicPr>
+                  <pic:blipFill>
+                    <a:blip r:embed="rId9" cstate="print">
+                      <a:extLst>
+                        <a:ext uri="{28A0092B-C50C-407E-A947-70E740481C1C}">
+                          <a14:useLocalDpi xmlns:a14="http://schemas.microsoft.com/office/drawing/2010/main" val="0"/>
+                        </a:ext>
+                      </a:extLst>
+                    </a:blip>
+                    <a:stretch>
+                      <a:fillRect/>
+                    </a:stretch>
+                  </pic:blipFill>
+                  <pic:spPr>
+                    <a:xfrm>
+                      <a:off x="0" y="0"/>
+                      <a:ext cx="5731510" cy="2878455"/>
+                    </a:xfrm>
+                    <a:prstGeom prst="rect">
+                      <a:avLst/>
+                    </a:prstGeom>
+                  </pic:spPr>
+                </pic:pic>
+              </a:graphicData>
+            </a:graphic>
+          </wp:inline>
+        </w:drawing>
+      </w:r>
+    </w:p>
+    <w:p>
+      <w:pPr>
+        <w:jc w:val="both"/>
+        <w:rPr>
+          <w:sz w:val="44"/>
+          <w:szCs w:val="44"/>
+          <w:u w:val="single"/>
+        </w:rPr>
+      </w:pPr>
+      <w:r>
+        <w:rPr>
+          <w:noProof/>
+          <w:sz w:val="44"/>
+          <w:szCs w:val="44"/>
+          <w:u w:val="single"/>
+        </w:rPr>
+        <w:drawing>
+          <wp:inline distT="0" distB="0" distL="0" distR="0" wp14:anchorId="40AA898E" wp14:editId="721D3D95">
+            <wp:extent cx="5731510" cy="521970"/>
+            <wp:effectExtent l="0" t="0" r="0" b="0"/>
+            <wp:docPr id="1112945476" name="Picture 2"/>
+            <wp:cNvGraphicFramePr>
+              <a:graphicFrameLocks xmlns:a="http://schemas.openxmlformats.org/drawingml/2006/main" noChangeAspect="1"/>
+            </wp:cNvGraphicFramePr>
+            <a:graphic xmlns:a="http://schemas.openxmlformats.org/drawingml/2006/main">
+              <a:graphicData uri="http://schemas.openxmlformats.org/drawingml/2006/picture">
+                <pic:pic xmlns:pic="http://schemas.openxmlformats.org/drawingml/2006/picture">
+                  <pic:nvPicPr>
+                    <pic:cNvPr id="1112945476" name="Picture 1112945476"/>
+                    <pic:cNvPicPr/>
+                  </pic:nvPicPr>
+                  <pic:blipFill>
+                    <a:blip r:embed="rId10" cstate="print">
+                      <a:extLst>
+                        <a:ext uri="{28A0092B-C50C-407E-A947-70E740481C1C}">
+                          <a14:useLocalDpi xmlns:a14="http://schemas.microsoft.com/office/drawing/2010/main" val="0"/>
+                        </a:ext>
+                      </a:extLst>
+                    </a:blip>
+                    <a:stretch>
+                      <a:fillRect/>
+                    </a:stretch>
+                  </pic:blipFill>
+                  <pic:spPr>
+                    <a:xfrm>
+                      <a:off x="0" y="0"/>
+                      <a:ext cx="5731510" cy="521970"/>
+                    </a:xfrm>
+                    <a:prstGeom prst="rect">
+                      <a:avLst/>
+                    </a:prstGeom>
+                  </pic:spPr>
+                </pic:pic>
+              </a:graphicData>
+            </a:graphic>
+          </wp:inline>
+        </w:drawing>
+      </w:r>
+    </w:p>
+    <w:p>
+      <w:pPr>
+        <w:jc w:val="both"/>
+        <w:rPr>
+          <w:sz w:val="44"/>
+          <w:szCs w:val="44"/>
+          <w:u w:val="single"/>
+        </w:rPr>
+      </w:pPr>
+      <w:r>
+        <w:rPr>
+          <w:noProof/>
+          <w:sz w:val="44"/>
+          <w:szCs w:val="44"/>
+          <w:u w:val="single"/>
+        </w:rPr>
+        <w:drawing>
+          <wp:inline distT="0" distB="0" distL="0" distR="0" wp14:anchorId="005F5813" wp14:editId="107BA2B2">
+            <wp:extent cx="5731510" cy="521970"/>
+            <wp:effectExtent l="0" t="0" r="0" b="0"/>
+            <wp:docPr id="1608759705" name="Picture 3"/>
+            <wp:cNvGraphicFramePr>
+              <a:graphicFrameLocks xmlns:a="http://schemas.openxmlformats.org/drawingml/2006/main" noChangeAspect="1"/>
+            </wp:cNvGraphicFramePr>
+            <a:graphic xmlns:a="http://schemas.openxmlformats.org/drawingml/2006/main">
+              <a:graphicData uri="http://schemas.openxmlformats.org/drawingml/2006/picture">
+                <pic:pic xmlns:pic="http://schemas.openxmlformats.org/drawingml/2006/picture">
+                  <pic:nvPicPr>
+                    <pic:cNvPr id="1608759705" name="Picture 1608759705"/>
+                    <pic:cNvPicPr/>
+                  </pic:nvPicPr>
+                  <pic:blipFill>
+                    <a:blip r:embed="rId11" cstate="print">
+                      <a:extLst>
+                        <a:ext uri="{28A0092B-C50C-407E-A947-70E740481C1C}">
+                          <a14:useLocalDpi xmlns:a14="http://schemas.microsoft.com/office/drawing/2010/main" val="0"/>
+                        </a:ext>
+                      </a:extLst>
+                    </a:blip>
+                    <a:stretch>
+                      <a:fillRect/>
+                    </a:stretch>
+                  </pic:blipFill>
+                  <pic:spPr>
+                    <a:xfrm>
+                      <a:off x="0" y="0"/>
+                      <a:ext cx="5731510" cy="521970"/>
+                    </a:xfrm>
+                    <a:prstGeom prst="rect">
+                      <a:avLst/>
+                    </a:prstGeom>
+                  </pic:spPr>
+                </pic:pic>
+              </a:graphicData>
+            </a:graphic>
+          </wp:inline>
+        </w:drawing>
+      </w:r>
     </w:p>
     <w:p>
       <w:pPr>

</xml_diff>

<commit_message>
Add new Jupyter notebook for Week 5 on Deep Fake Generation; update LABlogbook
</commit_message>
<xml_diff>
--- a/LABlogbook.docx
+++ b/LABlogbook.docx
@@ -773,6 +773,55 @@
           <w:u w:val="single"/>
         </w:rPr>
       </w:pPr>
+      <w:r>
+        <w:rPr>
+          <w:noProof/>
+          <w:sz w:val="44"/>
+          <w:szCs w:val="44"/>
+          <w:u w:val="single"/>
+        </w:rPr>
+        <w:drawing>
+          <wp:inline distT="0" distB="0" distL="0" distR="0" wp14:anchorId="753684DC" wp14:editId="37868FD6">
+            <wp:extent cx="5731510" cy="2031365"/>
+            <wp:effectExtent l="0" t="0" r="0" b="635"/>
+            <wp:docPr id="811841176" name="Picture 4" descr="A screenshot of a computer&#10;&#10;AI-generated content may be incorrect."/>
+            <wp:cNvGraphicFramePr>
+              <a:graphicFrameLocks xmlns:a="http://schemas.openxmlformats.org/drawingml/2006/main" noChangeAspect="1"/>
+            </wp:cNvGraphicFramePr>
+            <a:graphic xmlns:a="http://schemas.openxmlformats.org/drawingml/2006/main">
+              <a:graphicData uri="http://schemas.openxmlformats.org/drawingml/2006/picture">
+                <pic:pic xmlns:pic="http://schemas.openxmlformats.org/drawingml/2006/picture">
+                  <pic:nvPicPr>
+                    <pic:cNvPr id="811841176" name="Picture 4" descr="A screenshot of a computer&#10;&#10;AI-generated content may be incorrect."/>
+                    <pic:cNvPicPr/>
+                  </pic:nvPicPr>
+                  <pic:blipFill>
+                    <a:blip r:embed="rId12" cstate="print">
+                      <a:extLst>
+                        <a:ext uri="{28A0092B-C50C-407E-A947-70E740481C1C}">
+                          <a14:useLocalDpi xmlns:a14="http://schemas.microsoft.com/office/drawing/2010/main" val="0"/>
+                        </a:ext>
+                      </a:extLst>
+                    </a:blip>
+                    <a:stretch>
+                      <a:fillRect/>
+                    </a:stretch>
+                  </pic:blipFill>
+                  <pic:spPr>
+                    <a:xfrm>
+                      <a:off x="0" y="0"/>
+                      <a:ext cx="5731510" cy="2031365"/>
+                    </a:xfrm>
+                    <a:prstGeom prst="rect">
+                      <a:avLst/>
+                    </a:prstGeom>
+                  </pic:spPr>
+                </pic:pic>
+              </a:graphicData>
+            </a:graphic>
+          </wp:inline>
+        </w:drawing>
+      </w:r>
     </w:p>
     <w:p>
       <w:pPr>

</xml_diff>

<commit_message>
Update logbook and add a new notebook
</commit_message>
<xml_diff>
--- a/LABlogbook.docx
+++ b/LABlogbook.docx
@@ -1551,6 +1551,130 @@
           <w:u w:val="single"/>
         </w:rPr>
       </w:pPr>
+      <w:r>
+        <w:rPr>
+          <w:noProof/>
+          <w:sz w:val="44"/>
+          <w:szCs w:val="44"/>
+          <w:u w:val="single"/>
+        </w:rPr>
+        <w:drawing>
+          <wp:inline distT="0" distB="0" distL="0" distR="0" wp14:anchorId="51EE1663" wp14:editId="7C7D8053">
+            <wp:extent cx="5731510" cy="2690495"/>
+            <wp:effectExtent l="0" t="0" r="0" b="1905"/>
+            <wp:docPr id="1109891667" name="Picture 3"/>
+            <wp:cNvGraphicFramePr>
+              <a:graphicFrameLocks xmlns:a="http://schemas.openxmlformats.org/drawingml/2006/main" noChangeAspect="1"/>
+            </wp:cNvGraphicFramePr>
+            <a:graphic xmlns:a="http://schemas.openxmlformats.org/drawingml/2006/main">
+              <a:graphicData uri="http://schemas.openxmlformats.org/drawingml/2006/picture">
+                <pic:pic xmlns:pic="http://schemas.openxmlformats.org/drawingml/2006/picture">
+                  <pic:nvPicPr>
+                    <pic:cNvPr id="1109891667" name="Picture 1109891667"/>
+                    <pic:cNvPicPr/>
+                  </pic:nvPicPr>
+                  <pic:blipFill>
+                    <a:blip r:embed="rId21" cstate="print">
+                      <a:extLst>
+                        <a:ext uri="{28A0092B-C50C-407E-A947-70E740481C1C}">
+                          <a14:useLocalDpi xmlns:a14="http://schemas.microsoft.com/office/drawing/2010/main" val="0"/>
+                        </a:ext>
+                      </a:extLst>
+                    </a:blip>
+                    <a:stretch>
+                      <a:fillRect/>
+                    </a:stretch>
+                  </pic:blipFill>
+                  <pic:spPr>
+                    <a:xfrm>
+                      <a:off x="0" y="0"/>
+                      <a:ext cx="5731510" cy="2690495"/>
+                    </a:xfrm>
+                    <a:prstGeom prst="rect">
+                      <a:avLst/>
+                    </a:prstGeom>
+                  </pic:spPr>
+                </pic:pic>
+              </a:graphicData>
+            </a:graphic>
+          </wp:inline>
+        </w:drawing>
+      </w:r>
+      <w:r>
+        <w:rPr>
+          <w:noProof/>
+          <w:sz w:val="44"/>
+          <w:szCs w:val="44"/>
+          <w:u w:val="single"/>
+        </w:rPr>
+        <w:drawing>
+          <wp:inline distT="0" distB="0" distL="0" distR="0" wp14:anchorId="5B39B45A" wp14:editId="4A749042">
+            <wp:extent cx="5730880" cy="2867660"/>
+            <wp:effectExtent l="0" t="0" r="0" b="2540"/>
+            <wp:docPr id="689746820" name="Picture 4"/>
+            <wp:cNvGraphicFramePr>
+              <a:graphicFrameLocks xmlns:a="http://schemas.openxmlformats.org/drawingml/2006/main" noChangeAspect="1"/>
+            </wp:cNvGraphicFramePr>
+            <a:graphic xmlns:a="http://schemas.openxmlformats.org/drawingml/2006/main">
+              <a:graphicData uri="http://schemas.openxmlformats.org/drawingml/2006/picture">
+                <pic:pic xmlns:pic="http://schemas.openxmlformats.org/drawingml/2006/picture">
+                  <pic:nvPicPr>
+                    <pic:cNvPr id="689746820" name="Picture 4"/>
+                    <pic:cNvPicPr/>
+                  </pic:nvPicPr>
+                  <pic:blipFill>
+                    <a:blip r:embed="rId22" cstate="print">
+                      <a:extLst>
+                        <a:ext uri="{28A0092B-C50C-407E-A947-70E740481C1C}">
+                          <a14:useLocalDpi xmlns:a14="http://schemas.microsoft.com/office/drawing/2010/main" val="0"/>
+                        </a:ext>
+                      </a:extLst>
+                    </a:blip>
+                    <a:stretch>
+                      <a:fillRect/>
+                    </a:stretch>
+                  </pic:blipFill>
+                  <pic:spPr>
+                    <a:xfrm>
+                      <a:off x="0" y="0"/>
+                      <a:ext cx="5730880" cy="2867660"/>
+                    </a:xfrm>
+                    <a:prstGeom prst="rect">
+                      <a:avLst/>
+                    </a:prstGeom>
+                  </pic:spPr>
+                </pic:pic>
+              </a:graphicData>
+            </a:graphic>
+          </wp:inline>
+        </w:drawing>
+      </w:r>
+    </w:p>
+    <w:p>
+      <w:pPr>
+        <w:spacing w:after="0" w:line="360" w:lineRule="auto"/>
+        <w:rPr>
+          <w:rFonts w:eastAsia="Times New Roman" w:cstheme="minorHAnsi"/>
+          <w:color w:val="0E0E0E"/>
+          <w:kern w:val="0"/>
+          <w:sz w:val="24"/>
+          <w:szCs w:val="24"/>
+          <w:lang w:eastAsia="en-GB"/>
+          <w14:ligatures w14:val="none"/>
+        </w:rPr>
+      </w:pPr>
+      <w:r>
+        <w:rPr>
+          <w:rFonts w:eastAsia="Times New Roman" w:cstheme="minorHAnsi"/>
+          <w:color w:val="0E0E0E"/>
+          <w:kern w:val="0"/>
+          <w:sz w:val="24"/>
+          <w:szCs w:val="24"/>
+          <w:lang w:eastAsia="en-GB"/>
+          <w14:ligatures w14:val="none"/>
+        </w:rPr>
+        <w:t>The bar graph compares the performance of the classification models using accuracy, precision, recall, and F1 score. It shows that all models performed strongly on the KDD attack classification dataset, with Random Forest achieving the strongest overall performance among the models shown.</w:t>
+      </w:r>
     </w:p>
     <w:p>
       <w:pPr>
@@ -1561,6 +1685,16 @@
           <w:u w:val="single"/>
         </w:rPr>
       </w:pPr>
+    </w:p>
+    <w:p>
+      <w:pPr>
+        <w:jc w:val="both"/>
+        <w:rPr>
+          <w:sz w:val="44"/>
+          <w:szCs w:val="44"/>
+          <w:u w:val="single"/>
+        </w:rPr>
+      </w:pPr>
       <w:r>
         <w:rPr>
           <w:sz w:val="44"/>
@@ -1594,6 +1728,7 @@
           <w:szCs w:val="44"/>
           <w:u w:val="single"/>
         </w:rPr>
+        <w:lastRenderedPageBreak/>
         <w:t>Lab 12</w:t>
       </w:r>
     </w:p>

</xml_diff>

<commit_message>
Add weeks 10 and 11 notebooks
</commit_message>
<xml_diff>
--- a/LABlogbook.docx
+++ b/LABlogbook.docx
@@ -19,6 +19,16 @@
         </w:rPr>
         <w:t>LAB Logbook</w:t>
       </w:r>
+    </w:p>
+    <w:p>
+      <w:pPr>
+        <w:jc w:val="center"/>
+        <w:rPr>
+          <w:sz w:val="56"/>
+          <w:szCs w:val="56"/>
+          <w:u w:val="single"/>
+        </w:rPr>
+      </w:pPr>
     </w:p>
     <w:p>
       <w:pPr>
@@ -339,7 +349,7 @@
           <w:sz w:val="24"/>
           <w:szCs w:val="24"/>
         </w:rPr>
-        <w:t>EDA plot created by me is boxplot</w:t>
+        <w:t>EDA plot created is boxplot</w:t>
       </w:r>
     </w:p>
     <w:p>
@@ -645,7 +655,7 @@
           <w:u w:val="single"/>
         </w:rPr>
         <w:drawing>
-          <wp:inline distT="0" distB="0" distL="0" distR="0" wp14:anchorId="40AA898E" wp14:editId="0135B0E4">
+          <wp:inline distT="0" distB="0" distL="0" distR="0" wp14:anchorId="40AA898E" wp14:editId="48D0E0FC">
             <wp:extent cx="5731510" cy="521970"/>
             <wp:effectExtent l="0" t="0" r="0" b="0"/>
             <wp:docPr id="1112945476" name="Picture 2"/>
@@ -704,7 +714,7 @@
           <w:u w:val="single"/>
         </w:rPr>
         <w:drawing>
-          <wp:inline distT="0" distB="0" distL="0" distR="0" wp14:anchorId="005F5813" wp14:editId="7EB858DA">
+          <wp:inline distT="0" distB="0" distL="0" distR="0" wp14:anchorId="005F5813" wp14:editId="2FD2E611">
             <wp:extent cx="5731510" cy="521970"/>
             <wp:effectExtent l="0" t="0" r="0" b="0"/>
             <wp:docPr id="1608759705" name="Picture 3"/>
@@ -1712,25 +1722,217 @@
           <w:szCs w:val="44"/>
         </w:rPr>
       </w:pPr>
-    </w:p>
-    <w:p>
-      <w:pPr>
-        <w:jc w:val="both"/>
-        <w:rPr>
-          <w:sz w:val="44"/>
-          <w:szCs w:val="44"/>
-          <w:u w:val="single"/>
-        </w:rPr>
-      </w:pPr>
-      <w:r>
-        <w:rPr>
-          <w:sz w:val="44"/>
-          <w:szCs w:val="44"/>
-          <w:u w:val="single"/>
+      <w:r>
+        <w:rPr>
+          <w:noProof/>
+          <w:sz w:val="44"/>
+          <w:szCs w:val="44"/>
         </w:rPr>
         <w:lastRenderedPageBreak/>
+        <w:drawing>
+          <wp:inline distT="0" distB="0" distL="0" distR="0" wp14:anchorId="22F0D698" wp14:editId="078027D4">
+            <wp:extent cx="5731510" cy="2955290"/>
+            <wp:effectExtent l="0" t="0" r="0" b="3810"/>
+            <wp:docPr id="1800182952" name="Picture 1"/>
+            <wp:cNvGraphicFramePr>
+              <a:graphicFrameLocks xmlns:a="http://schemas.openxmlformats.org/drawingml/2006/main" noChangeAspect="1"/>
+            </wp:cNvGraphicFramePr>
+            <a:graphic xmlns:a="http://schemas.openxmlformats.org/drawingml/2006/main">
+              <a:graphicData uri="http://schemas.openxmlformats.org/drawingml/2006/picture">
+                <pic:pic xmlns:pic="http://schemas.openxmlformats.org/drawingml/2006/picture">
+                  <pic:nvPicPr>
+                    <pic:cNvPr id="1800182952" name="Picture 1800182952"/>
+                    <pic:cNvPicPr/>
+                  </pic:nvPicPr>
+                  <pic:blipFill>
+                    <a:blip r:embed="rId23" cstate="print">
+                      <a:extLst>
+                        <a:ext uri="{28A0092B-C50C-407E-A947-70E740481C1C}">
+                          <a14:useLocalDpi xmlns:a14="http://schemas.microsoft.com/office/drawing/2010/main" val="0"/>
+                        </a:ext>
+                      </a:extLst>
+                    </a:blip>
+                    <a:stretch>
+                      <a:fillRect/>
+                    </a:stretch>
+                  </pic:blipFill>
+                  <pic:spPr>
+                    <a:xfrm>
+                      <a:off x="0" y="0"/>
+                      <a:ext cx="5731510" cy="2955290"/>
+                    </a:xfrm>
+                    <a:prstGeom prst="rect">
+                      <a:avLst/>
+                    </a:prstGeom>
+                  </pic:spPr>
+                </pic:pic>
+              </a:graphicData>
+            </a:graphic>
+          </wp:inline>
+        </w:drawing>
+      </w:r>
+    </w:p>
+    <w:p>
+      <w:pPr>
+        <w:spacing w:line="360" w:lineRule="auto"/>
+        <w:rPr>
+          <w:sz w:val="24"/>
+          <w:szCs w:val="24"/>
+          <w:lang w:eastAsia="en-GB"/>
+        </w:rPr>
+      </w:pPr>
+      <w:r>
+        <w:rPr>
+          <w:sz w:val="24"/>
+          <w:szCs w:val="24"/>
+          <w:lang w:eastAsia="en-GB"/>
+        </w:rPr>
+        <w:t>This bar chart compares the performance of Logistic Regression, Random Forest, and Gradient Boosting on the Android malware classification task using accuracy, precision, recall, and F1 score. The graph shows that Random Forest and Gradient Boosting performed slightly better overall than Logistic Regression.</w:t>
+      </w:r>
+    </w:p>
+    <w:p>
+      <w:pPr>
+        <w:jc w:val="both"/>
+        <w:rPr>
+          <w:sz w:val="44"/>
+          <w:szCs w:val="44"/>
+        </w:rPr>
+      </w:pPr>
+    </w:p>
+    <w:p>
+      <w:pPr>
+        <w:jc w:val="both"/>
+        <w:rPr>
+          <w:sz w:val="44"/>
+          <w:szCs w:val="44"/>
+          <w:u w:val="single"/>
+        </w:rPr>
+      </w:pPr>
+      <w:r>
+        <w:rPr>
+          <w:sz w:val="44"/>
+          <w:szCs w:val="44"/>
+          <w:u w:val="single"/>
+        </w:rPr>
         <w:t>Lab 12</w:t>
       </w:r>
+    </w:p>
+    <w:p>
+      <w:pPr>
+        <w:jc w:val="both"/>
+        <w:rPr>
+          <w:sz w:val="44"/>
+          <w:szCs w:val="44"/>
+        </w:rPr>
+      </w:pPr>
+    </w:p>
+    <w:p>
+      <w:pPr>
+        <w:jc w:val="both"/>
+        <w:rPr>
+          <w:sz w:val="44"/>
+          <w:szCs w:val="44"/>
+          <w:u w:val="single"/>
+        </w:rPr>
+      </w:pPr>
+    </w:p>
+    <w:p>
+      <w:pPr>
+        <w:jc w:val="both"/>
+        <w:rPr>
+          <w:sz w:val="44"/>
+          <w:szCs w:val="44"/>
+          <w:u w:val="single"/>
+        </w:rPr>
+      </w:pPr>
+    </w:p>
+    <w:p>
+      <w:pPr>
+        <w:jc w:val="both"/>
+        <w:rPr>
+          <w:sz w:val="44"/>
+          <w:szCs w:val="44"/>
+          <w:u w:val="single"/>
+        </w:rPr>
+      </w:pPr>
+    </w:p>
+    <w:p>
+      <w:pPr>
+        <w:rPr>
+          <w:sz w:val="44"/>
+          <w:szCs w:val="44"/>
+          <w:u w:val="single"/>
+        </w:rPr>
+      </w:pPr>
+      <w:r>
+        <w:rPr>
+          <w:sz w:val="44"/>
+          <w:szCs w:val="44"/>
+          <w:u w:val="single"/>
+        </w:rPr>
+        <w:t>GitHub Repository (Practical Exercises)</w:t>
+      </w:r>
+    </w:p>
+    <w:p>
+      <w:pPr>
+        <w:rPr>
+          <w:sz w:val="36"/>
+          <w:szCs w:val="36"/>
+          <w:lang w:eastAsia="en-GB"/>
+        </w:rPr>
+      </w:pPr>
+      <w:r>
+        <w:rPr>
+          <w:sz w:val="36"/>
+          <w:szCs w:val="36"/>
+          <w:lang w:eastAsia="en-GB"/>
+        </w:rPr>
+        <w:t>GitHub repository containing all weekly practical exercises and lab</w:t>
+      </w:r>
+      <w:r>
+        <w:rPr>
+          <w:sz w:val="36"/>
+          <w:szCs w:val="36"/>
+          <w:lang w:eastAsia="en-GB"/>
+        </w:rPr>
+        <w:t xml:space="preserve"> </w:t>
+      </w:r>
+      <w:proofErr w:type="spellStart"/>
+      <w:r>
+        <w:rPr>
+          <w:sz w:val="36"/>
+          <w:szCs w:val="36"/>
+          <w:lang w:eastAsia="en-GB"/>
+        </w:rPr>
+        <w:t>jupyter</w:t>
+      </w:r>
+      <w:proofErr w:type="spellEnd"/>
+      <w:r>
+        <w:rPr>
+          <w:sz w:val="36"/>
+          <w:szCs w:val="36"/>
+          <w:lang w:eastAsia="en-GB"/>
+        </w:rPr>
+        <w:t xml:space="preserve"> notebooks:</w:t>
+      </w:r>
+    </w:p>
+    <w:p>
+      <w:pPr>
+        <w:rPr>
+          <w:sz w:val="40"/>
+          <w:szCs w:val="40"/>
+        </w:rPr>
+      </w:pPr>
+      <w:hyperlink r:id="rId24" w:history="1">
+        <w:r>
+          <w:rPr>
+            <w:rStyle w:val="Hyperlink"/>
+            <w:sz w:val="40"/>
+            <w:szCs w:val="40"/>
+          </w:rPr>
+          <w:t>https://github.com/ranselorm/cybersescurity-ai</w:t>
+        </w:r>
+      </w:hyperlink>
     </w:p>
     <w:sectPr>
       <w:pgSz w:w="11906" w:h="16838"/>

</xml_diff>